<commit_message>
UI modernization: Complete MetricCards implementation + documentation
- Modernized Key Metrics section with 12 professional MetricCard components
- Fixed missing metrics in dev (now matches production exactly)
- Added ResultsSection component with TypeScript for future UI improvements
- Updated metrics documentation with implementation status and SFR-specific sections
- All 134+ metrics preserved, 80+ fully implemented with modern UI
- Build successful, production-ready
</commit_message>
<xml_diff>
--- a/temp/temp.docx
+++ b/temp/temp.docx
@@ -3,13 +3,39 @@
 <w:document xmlns:wpc="http://schemas.microsoft.com/office/word/2010/wordprocessingCanvas" xmlns:cx="http://schemas.microsoft.com/office/drawing/2014/chartex" xmlns:cx1="http://schemas.microsoft.com/office/drawing/2015/9/8/chartex" xmlns:cx2="http://schemas.microsoft.com/office/drawing/2015/10/21/chartex" xmlns:cx3="http://schemas.microsoft.com/office/drawing/2016/5/9/chartex" xmlns:cx4="http://schemas.microsoft.com/office/drawing/2016/5/10/chartex" xmlns:cx5="http://schemas.microsoft.com/office/drawing/2016/5/11/chartex" xmlns:cx6="http://schemas.microsoft.com/office/drawing/2016/5/12/chartex" xmlns:cx7="http://schemas.microsoft.com/office/drawing/2016/5/13/chartex" xmlns:cx8="http://schemas.microsoft.com/office/drawing/2016/5/14/chartex" xmlns:mc="http://schemas.openxmlformats.org/markup-compatibility/2006" xmlns:aink="http://schemas.microsoft.com/office/drawing/2016/ink" xmlns:am3d="http://schemas.microsoft.com/office/drawing/2017/model3d" xmlns:o="urn:schemas-microsoft-com:office:office" xmlns:oel="http://schemas.microsoft.com/office/2019/extlst" xmlns:r="http://schemas.openxmlformats.org/officeDocument/2006/relationships" xmlns:m="http://schemas.openxmlformats.org/officeDocument/2006/math" xmlns:v="urn:schemas-microsoft-com:vml" xmlns:wp14="http://schemas.microsoft.com/office/word/2010/wordprocessingDrawing" xmlns:wp="http://schemas.openxmlformats.org/drawingml/2006/wordprocessingDrawing" xmlns:w10="urn:schemas-microsoft-com:office:word" xmlns:w="http://schemas.openxmlformats.org/wordprocessingml/2006/main" xmlns:w14="http://schemas.microsoft.com/office/word/2010/wordml" xmlns:w15="http://schemas.microsoft.com/office/word/2012/wordml" xmlns:w16cex="http://schemas.microsoft.com/office/word/2018/wordml/cex" xmlns:w16cid="http://schemas.microsoft.com/office/word/2016/wordml/cid" xmlns:w16="http://schemas.microsoft.com/office/word/2018/wordml" xmlns:w16sdtdh="http://schemas.microsoft.com/office/word/2020/wordml/sdtdatahash" xmlns:w16se="http://schemas.microsoft.com/office/word/2015/wordml/symex" xmlns:wpg="http://schemas.microsoft.com/office/word/2010/wordprocessingGroup" xmlns:wpi="http://schemas.microsoft.com/office/word/2010/wordprocessingInk" xmlns:wne="http://schemas.microsoft.com/office/word/2006/wordml" xmlns:wps="http://schemas.microsoft.com/office/word/2010/wordprocessingShape" mc:Ignorable="w14 w15 w16se w16cid w16 w16cex w16sdtdh wp14">
   <w:body>
     <w:p/>
+    <w:p/>
+    <w:p/>
+    <w:p>
+      <w:r>
+        <w:t xml:space="preserve">First login page </w:t>
+      </w:r>
+      <w:proofErr w:type="spellStart"/>
+      <w:r>
+        <w:t>appers</w:t>
+      </w:r>
+      <w:proofErr w:type="spellEnd"/>
+      <w:r>
+        <w:t xml:space="preserve"> like </w:t>
+      </w:r>
+      <w:proofErr w:type="gramStart"/>
+      <w:r>
+        <w:t>this ,</w:t>
+      </w:r>
+      <w:proofErr w:type="gramEnd"/>
+      <w:r>
+        <w:t xml:space="preserve"> this is very on left not in center, </w:t>
+      </w:r>
+    </w:p>
+    <w:p/>
+    <w:p/>
+    <w:p/>
     <w:p>
       <w:r>
         <w:drawing>
-          <wp:inline distT="0" distB="0" distL="0" distR="0" wp14:anchorId="4A0D4BF3" wp14:editId="731818A4">
-            <wp:extent cx="5943600" cy="3856990"/>
-            <wp:effectExtent l="0" t="0" r="0" b="3810"/>
-            <wp:docPr id="127028015" name="Picture 1" descr="A screenshot of a computer&#10;&#10;Description automatically generated"/>
+          <wp:inline distT="0" distB="0" distL="0" distR="0" wp14:anchorId="127E4008" wp14:editId="53C4F741">
+            <wp:extent cx="5943600" cy="3006725"/>
+            <wp:effectExtent l="0" t="0" r="0" b="3175"/>
+            <wp:docPr id="1309097754" name="Picture 1" descr="A screenshot of a phone&#10;&#10;Description automatically generated"/>
             <wp:cNvGraphicFramePr>
               <a:graphicFrameLocks xmlns:a="http://schemas.openxmlformats.org/drawingml/2006/main" noChangeAspect="1"/>
             </wp:cNvGraphicFramePr>
@@ -17,7 +43,7 @@
               <a:graphicData uri="http://schemas.openxmlformats.org/drawingml/2006/picture">
                 <pic:pic xmlns:pic="http://schemas.openxmlformats.org/drawingml/2006/picture">
                   <pic:nvPicPr>
-                    <pic:cNvPr id="127028015" name="Picture 1" descr="A screenshot of a computer&#10;&#10;Description automatically generated"/>
+                    <pic:cNvPr id="1309097754" name="Picture 1" descr="A screenshot of a phone&#10;&#10;Description automatically generated"/>
                     <pic:cNvPicPr/>
                   </pic:nvPicPr>
                   <pic:blipFill>
@@ -29,7 +55,7 @@
                   <pic:spPr>
                     <a:xfrm>
                       <a:off x="0" y="0"/>
-                      <a:ext cx="5943600" cy="3856990"/>
+                      <a:ext cx="5943600" cy="3006725"/>
                     </a:xfrm>
                     <a:prstGeom prst="rect">
                       <a:avLst/>
@@ -43,17 +69,27 @@
       </w:r>
     </w:p>
     <w:p/>
-    <w:p/>
-    <w:p/>
-    <w:p/>
-    <w:p>
-      <w:r>
-        <w:lastRenderedPageBreak/>
+    <w:p>
+      <w:r>
+        <w:t xml:space="preserve">Once logged in here is the </w:t>
+      </w:r>
+      <w:proofErr w:type="gramStart"/>
+      <w:r>
+        <w:t>dashboard ,</w:t>
+      </w:r>
+      <w:proofErr w:type="gramEnd"/>
+      <w:r>
+        <w:t xml:space="preserve"> to me it looks ok but can be improved </w:t>
+      </w:r>
+    </w:p>
+    <w:p/>
+    <w:p>
+      <w:r>
         <w:drawing>
-          <wp:inline distT="0" distB="0" distL="0" distR="0" wp14:anchorId="6D08C4CA" wp14:editId="0B221BA9">
-            <wp:extent cx="5943600" cy="5029200"/>
+          <wp:inline distT="0" distB="0" distL="0" distR="0" wp14:anchorId="43856993" wp14:editId="3E2AADB0">
+            <wp:extent cx="5943600" cy="3124835"/>
             <wp:effectExtent l="0" t="0" r="0" b="0"/>
-            <wp:docPr id="446371319" name="Picture 1" descr="A screenshot of a computer&#10;&#10;Description automatically generated"/>
+            <wp:docPr id="198409507" name="Picture 1" descr="A screenshot of a computer&#10;&#10;Description automatically generated"/>
             <wp:cNvGraphicFramePr>
               <a:graphicFrameLocks xmlns:a="http://schemas.openxmlformats.org/drawingml/2006/main" noChangeAspect="1"/>
             </wp:cNvGraphicFramePr>
@@ -61,7 +97,7 @@
               <a:graphicData uri="http://schemas.openxmlformats.org/drawingml/2006/picture">
                 <pic:pic xmlns:pic="http://schemas.openxmlformats.org/drawingml/2006/picture">
                   <pic:nvPicPr>
-                    <pic:cNvPr id="446371319" name="Picture 1" descr="A screenshot of a computer&#10;&#10;Description automatically generated"/>
+                    <pic:cNvPr id="198409507" name="Picture 1" descr="A screenshot of a computer&#10;&#10;Description automatically generated"/>
                     <pic:cNvPicPr/>
                   </pic:nvPicPr>
                   <pic:blipFill>
@@ -73,7 +109,664 @@
                   <pic:spPr>
                     <a:xfrm>
                       <a:off x="0" y="0"/>
-                      <a:ext cx="5943600" cy="5029200"/>
+                      <a:ext cx="5943600" cy="3124835"/>
+                    </a:xfrm>
+                    <a:prstGeom prst="rect">
+                      <a:avLst/>
+                    </a:prstGeom>
+                  </pic:spPr>
+                </pic:pic>
+              </a:graphicData>
+            </a:graphic>
+          </wp:inline>
+        </w:drawing>
+      </w:r>
+    </w:p>
+    <w:p/>
+    <w:p/>
+    <w:p>
+      <w:r>
+        <w:t xml:space="preserve">Once User clicks on new SFR </w:t>
+      </w:r>
+      <w:proofErr w:type="gramStart"/>
+      <w:r>
+        <w:t>analysis ,</w:t>
+      </w:r>
+      <w:proofErr w:type="gramEnd"/>
+      <w:r>
+        <w:t xml:space="preserve"> following page comes up with default manual input page with option of selecting wizard on the top </w:t>
+      </w:r>
+    </w:p>
+    <w:p/>
+    <w:p>
+      <w:r>
+        <w:drawing>
+          <wp:inline distT="0" distB="0" distL="0" distR="0" wp14:anchorId="590CF52F" wp14:editId="20860936">
+            <wp:extent cx="5943600" cy="5544185"/>
+            <wp:effectExtent l="0" t="0" r="0" b="5715"/>
+            <wp:docPr id="1978538366" name="Picture 1" descr="A screenshot of a computer&#10;&#10;Description automatically generated"/>
+            <wp:cNvGraphicFramePr>
+              <a:graphicFrameLocks xmlns:a="http://schemas.openxmlformats.org/drawingml/2006/main" noChangeAspect="1"/>
+            </wp:cNvGraphicFramePr>
+            <a:graphic xmlns:a="http://schemas.openxmlformats.org/drawingml/2006/main">
+              <a:graphicData uri="http://schemas.openxmlformats.org/drawingml/2006/picture">
+                <pic:pic xmlns:pic="http://schemas.openxmlformats.org/drawingml/2006/picture">
+                  <pic:nvPicPr>
+                    <pic:cNvPr id="1978538366" name="Picture 1" descr="A screenshot of a computer&#10;&#10;Description automatically generated"/>
+                    <pic:cNvPicPr/>
+                  </pic:nvPicPr>
+                  <pic:blipFill>
+                    <a:blip r:embed="rId6"/>
+                    <a:stretch>
+                      <a:fillRect/>
+                    </a:stretch>
+                  </pic:blipFill>
+                  <pic:spPr>
+                    <a:xfrm>
+                      <a:off x="0" y="0"/>
+                      <a:ext cx="5943600" cy="5544185"/>
+                    </a:xfrm>
+                    <a:prstGeom prst="rect">
+                      <a:avLst/>
+                    </a:prstGeom>
+                  </pic:spPr>
+                </pic:pic>
+              </a:graphicData>
+            </a:graphic>
+          </wp:inline>
+        </w:drawing>
+      </w:r>
+    </w:p>
+    <w:p/>
+    <w:p/>
+    <w:p>
+      <w:r>
+        <w:t xml:space="preserve">Once user selects smart. Wizard </w:t>
+      </w:r>
+      <w:r>
+        <w:t>following</w:t>
+      </w:r>
+      <w:r>
+        <w:t xml:space="preserve"> shows up </w:t>
+      </w:r>
+      <w:r>
+        <w:t xml:space="preserve">where user enters the property address and then backend API fills up the rest of the information to get </w:t>
+      </w:r>
+      <w:proofErr w:type="gramStart"/>
+      <w:r>
+        <w:t>started</w:t>
+      </w:r>
+      <w:proofErr w:type="gramEnd"/>
+      <w:r>
+        <w:t xml:space="preserve"> </w:t>
+      </w:r>
+    </w:p>
+    <w:p/>
+    <w:p>
+      <w:r>
+        <w:lastRenderedPageBreak/>
+        <w:drawing>
+          <wp:inline distT="0" distB="0" distL="0" distR="0" wp14:anchorId="15E75BA5" wp14:editId="1012476D">
+            <wp:extent cx="5943600" cy="6653530"/>
+            <wp:effectExtent l="0" t="0" r="0" b="1270"/>
+            <wp:docPr id="616156083" name="Picture 1" descr="A screenshot of a computer&#10;&#10;Description automatically generated"/>
+            <wp:cNvGraphicFramePr>
+              <a:graphicFrameLocks xmlns:a="http://schemas.openxmlformats.org/drawingml/2006/main" noChangeAspect="1"/>
+            </wp:cNvGraphicFramePr>
+            <a:graphic xmlns:a="http://schemas.openxmlformats.org/drawingml/2006/main">
+              <a:graphicData uri="http://schemas.openxmlformats.org/drawingml/2006/picture">
+                <pic:pic xmlns:pic="http://schemas.openxmlformats.org/drawingml/2006/picture">
+                  <pic:nvPicPr>
+                    <pic:cNvPr id="616156083" name="Picture 1" descr="A screenshot of a computer&#10;&#10;Description automatically generated"/>
+                    <pic:cNvPicPr/>
+                  </pic:nvPicPr>
+                  <pic:blipFill>
+                    <a:blip r:embed="rId7"/>
+                    <a:stretch>
+                      <a:fillRect/>
+                    </a:stretch>
+                  </pic:blipFill>
+                  <pic:spPr>
+                    <a:xfrm>
+                      <a:off x="0" y="0"/>
+                      <a:ext cx="5943600" cy="6653530"/>
+                    </a:xfrm>
+                    <a:prstGeom prst="rect">
+                      <a:avLst/>
+                    </a:prstGeom>
+                  </pic:spPr>
+                </pic:pic>
+              </a:graphicData>
+            </a:graphic>
+          </wp:inline>
+        </w:drawing>
+      </w:r>
+    </w:p>
+    <w:p/>
+    <w:p>
+      <w:r>
+        <w:t xml:space="preserve">Then user is prompted to fill the financials/loan information </w:t>
+      </w:r>
+    </w:p>
+    <w:p/>
+    <w:p>
+      <w:r>
+        <w:lastRenderedPageBreak/>
+        <w:drawing>
+          <wp:inline distT="0" distB="0" distL="0" distR="0" wp14:anchorId="7E6CF7C9" wp14:editId="1E67A607">
+            <wp:extent cx="5943600" cy="6207125"/>
+            <wp:effectExtent l="0" t="0" r="0" b="3175"/>
+            <wp:docPr id="1978307414" name="Picture 1" descr="A screenshot of a computer&#10;&#10;Description automatically generated"/>
+            <wp:cNvGraphicFramePr>
+              <a:graphicFrameLocks xmlns:a="http://schemas.openxmlformats.org/drawingml/2006/main" noChangeAspect="1"/>
+            </wp:cNvGraphicFramePr>
+            <a:graphic xmlns:a="http://schemas.openxmlformats.org/drawingml/2006/main">
+              <a:graphicData uri="http://schemas.openxmlformats.org/drawingml/2006/picture">
+                <pic:pic xmlns:pic="http://schemas.openxmlformats.org/drawingml/2006/picture">
+                  <pic:nvPicPr>
+                    <pic:cNvPr id="1978307414" name="Picture 1" descr="A screenshot of a computer&#10;&#10;Description automatically generated"/>
+                    <pic:cNvPicPr/>
+                  </pic:nvPicPr>
+                  <pic:blipFill>
+                    <a:blip r:embed="rId8"/>
+                    <a:stretch>
+                      <a:fillRect/>
+                    </a:stretch>
+                  </pic:blipFill>
+                  <pic:spPr>
+                    <a:xfrm>
+                      <a:off x="0" y="0"/>
+                      <a:ext cx="5943600" cy="6207125"/>
+                    </a:xfrm>
+                    <a:prstGeom prst="rect">
+                      <a:avLst/>
+                    </a:prstGeom>
+                  </pic:spPr>
+                </pic:pic>
+              </a:graphicData>
+            </a:graphic>
+          </wp:inline>
+        </w:drawing>
+      </w:r>
+    </w:p>
+    <w:p/>
+    <w:p>
+      <w:r>
+        <w:t>Once user clicks on next it asked to enter renter analysis information</w:t>
+      </w:r>
+    </w:p>
+    <w:p/>
+    <w:p>
+      <w:r>
+        <w:lastRenderedPageBreak/>
+        <w:drawing>
+          <wp:inline distT="0" distB="0" distL="0" distR="0" wp14:anchorId="4C864D30" wp14:editId="25F3C5D2">
+            <wp:extent cx="5943600" cy="6357620"/>
+            <wp:effectExtent l="0" t="0" r="0" b="5080"/>
+            <wp:docPr id="220836265" name="Picture 1" descr="A screenshot of a computer&#10;&#10;Description automatically generated"/>
+            <wp:cNvGraphicFramePr>
+              <a:graphicFrameLocks xmlns:a="http://schemas.openxmlformats.org/drawingml/2006/main" noChangeAspect="1"/>
+            </wp:cNvGraphicFramePr>
+            <a:graphic xmlns:a="http://schemas.openxmlformats.org/drawingml/2006/main">
+              <a:graphicData uri="http://schemas.openxmlformats.org/drawingml/2006/picture">
+                <pic:pic xmlns:pic="http://schemas.openxmlformats.org/drawingml/2006/picture">
+                  <pic:nvPicPr>
+                    <pic:cNvPr id="220836265" name="Picture 1" descr="A screenshot of a computer&#10;&#10;Description automatically generated"/>
+                    <pic:cNvPicPr/>
+                  </pic:nvPicPr>
+                  <pic:blipFill>
+                    <a:blip r:embed="rId9"/>
+                    <a:stretch>
+                      <a:fillRect/>
+                    </a:stretch>
+                  </pic:blipFill>
+                  <pic:spPr>
+                    <a:xfrm>
+                      <a:off x="0" y="0"/>
+                      <a:ext cx="5943600" cy="6357620"/>
+                    </a:xfrm>
+                    <a:prstGeom prst="rect">
+                      <a:avLst/>
+                    </a:prstGeom>
+                  </pic:spPr>
+                </pic:pic>
+              </a:graphicData>
+            </a:graphic>
+          </wp:inline>
+        </w:drawing>
+      </w:r>
+    </w:p>
+    <w:p/>
+    <w:p>
+      <w:r>
+        <w:t xml:space="preserve">Then user is asked to enter other short term and </w:t>
+      </w:r>
+      <w:proofErr w:type="gramStart"/>
+      <w:r>
+        <w:t>long term</w:t>
+      </w:r>
+      <w:proofErr w:type="gramEnd"/>
+      <w:r>
+        <w:t xml:space="preserve"> analysis </w:t>
+      </w:r>
+    </w:p>
+    <w:p/>
+    <w:p>
+      <w:r>
+        <w:lastRenderedPageBreak/>
+        <w:drawing>
+          <wp:inline distT="0" distB="0" distL="0" distR="0" wp14:anchorId="413D4A71" wp14:editId="675DB0CF">
+            <wp:extent cx="5723890" cy="8229600"/>
+            <wp:effectExtent l="0" t="0" r="3810" b="0"/>
+            <wp:docPr id="1840995841" name="Picture 1" descr="A screenshot of a computer&#10;&#10;Description automatically generated"/>
+            <wp:cNvGraphicFramePr>
+              <a:graphicFrameLocks xmlns:a="http://schemas.openxmlformats.org/drawingml/2006/main" noChangeAspect="1"/>
+            </wp:cNvGraphicFramePr>
+            <a:graphic xmlns:a="http://schemas.openxmlformats.org/drawingml/2006/main">
+              <a:graphicData uri="http://schemas.openxmlformats.org/drawingml/2006/picture">
+                <pic:pic xmlns:pic="http://schemas.openxmlformats.org/drawingml/2006/picture">
+                  <pic:nvPicPr>
+                    <pic:cNvPr id="1840995841" name="Picture 1" descr="A screenshot of a computer&#10;&#10;Description automatically generated"/>
+                    <pic:cNvPicPr/>
+                  </pic:nvPicPr>
+                  <pic:blipFill>
+                    <a:blip r:embed="rId10"/>
+                    <a:stretch>
+                      <a:fillRect/>
+                    </a:stretch>
+                  </pic:blipFill>
+                  <pic:spPr>
+                    <a:xfrm>
+                      <a:off x="0" y="0"/>
+                      <a:ext cx="5723890" cy="8229600"/>
+                    </a:xfrm>
+                    <a:prstGeom prst="rect">
+                      <a:avLst/>
+                    </a:prstGeom>
+                  </pic:spPr>
+                </pic:pic>
+              </a:graphicData>
+            </a:graphic>
+          </wp:inline>
+        </w:drawing>
+      </w:r>
+    </w:p>
+    <w:p/>
+    <w:p>
+      <w:r>
+        <w:t xml:space="preserve">Once clicking on analysis following page comes up where on the </w:t>
+      </w:r>
+      <w:proofErr w:type="gramStart"/>
+      <w:r>
+        <w:t>top ,</w:t>
+      </w:r>
+      <w:proofErr w:type="gramEnd"/>
+      <w:r>
+        <w:t xml:space="preserve"> you can see the key metrics and some extended / pro level metrics are presented with best and worst case assumptions on profit/loss. Then there are series of tabs at the bottom with first one is AI analysis with bunch of scores and then AI analysis in detail</w:t>
+      </w:r>
+    </w:p>
+    <w:p/>
+    <w:p/>
+    <w:p/>
+    <w:p>
+      <w:r>
+        <w:lastRenderedPageBreak/>
+        <w:drawing>
+          <wp:inline distT="0" distB="0" distL="0" distR="0" wp14:anchorId="69FFA7DC" wp14:editId="0FD78874">
+            <wp:extent cx="5006975" cy="8229600"/>
+            <wp:effectExtent l="0" t="0" r="0" b="0"/>
+            <wp:docPr id="155391112" name="Picture 1" descr="A screenshot of a computer&#10;&#10;Description automatically generated"/>
+            <wp:cNvGraphicFramePr>
+              <a:graphicFrameLocks xmlns:a="http://schemas.openxmlformats.org/drawingml/2006/main" noChangeAspect="1"/>
+            </wp:cNvGraphicFramePr>
+            <a:graphic xmlns:a="http://schemas.openxmlformats.org/drawingml/2006/main">
+              <a:graphicData uri="http://schemas.openxmlformats.org/drawingml/2006/picture">
+                <pic:pic xmlns:pic="http://schemas.openxmlformats.org/drawingml/2006/picture">
+                  <pic:nvPicPr>
+                    <pic:cNvPr id="155391112" name="Picture 1" descr="A screenshot of a computer&#10;&#10;Description automatically generated"/>
+                    <pic:cNvPicPr/>
+                  </pic:nvPicPr>
+                  <pic:blipFill>
+                    <a:blip r:embed="rId11"/>
+                    <a:stretch>
+                      <a:fillRect/>
+                    </a:stretch>
+                  </pic:blipFill>
+                  <pic:spPr>
+                    <a:xfrm>
+                      <a:off x="0" y="0"/>
+                      <a:ext cx="5006975" cy="8229600"/>
+                    </a:xfrm>
+                    <a:prstGeom prst="rect">
+                      <a:avLst/>
+                    </a:prstGeom>
+                  </pic:spPr>
+                </pic:pic>
+              </a:graphicData>
+            </a:graphic>
+          </wp:inline>
+        </w:drawing>
+      </w:r>
+    </w:p>
+    <w:p/>
+    <w:p/>
+    <w:p>
+      <w:r>
+        <w:t xml:space="preserve">Then clicking on each tab presents more metrics and information </w:t>
+      </w:r>
+      <w:proofErr w:type="spellStart"/>
+      <w:r>
+        <w:t xml:space="preserve">for </w:t>
+      </w:r>
+      <w:proofErr w:type="spellEnd"/>
+      <w:r>
+        <w:t xml:space="preserve">user to analyze for their consumption and under </w:t>
+      </w:r>
+      <w:proofErr w:type="gramStart"/>
+      <w:r>
+        <w:t>writing</w:t>
+      </w:r>
+      <w:proofErr w:type="gramEnd"/>
+      <w:r>
+        <w:t xml:space="preserve"> </w:t>
+      </w:r>
+    </w:p>
+    <w:p/>
+    <w:p>
+      <w:pPr>
+        <w:rPr>
+          <w:noProof/>
+        </w:rPr>
+      </w:pPr>
+      <w:r>
+        <w:drawing>
+          <wp:inline distT="0" distB="0" distL="0" distR="0" wp14:anchorId="38A731B2" wp14:editId="136A25FD">
+            <wp:extent cx="5943600" cy="2355850"/>
+            <wp:effectExtent l="0" t="0" r="0" b="6350"/>
+            <wp:docPr id="2018083170" name="Picture 1" descr="A screenshot of a computer&#10;&#10;Description automatically generated"/>
+            <wp:cNvGraphicFramePr>
+              <a:graphicFrameLocks xmlns:a="http://schemas.openxmlformats.org/drawingml/2006/main" noChangeAspect="1"/>
+            </wp:cNvGraphicFramePr>
+            <a:graphic xmlns:a="http://schemas.openxmlformats.org/drawingml/2006/main">
+              <a:graphicData uri="http://schemas.openxmlformats.org/drawingml/2006/picture">
+                <pic:pic xmlns:pic="http://schemas.openxmlformats.org/drawingml/2006/picture">
+                  <pic:nvPicPr>
+                    <pic:cNvPr id="2018083170" name="Picture 1" descr="A screenshot of a computer&#10;&#10;Description automatically generated"/>
+                    <pic:cNvPicPr/>
+                  </pic:nvPicPr>
+                  <pic:blipFill>
+                    <a:blip r:embed="rId12"/>
+                    <a:stretch>
+                      <a:fillRect/>
+                    </a:stretch>
+                  </pic:blipFill>
+                  <pic:spPr>
+                    <a:xfrm>
+                      <a:off x="0" y="0"/>
+                      <a:ext cx="5943600" cy="2355850"/>
+                    </a:xfrm>
+                    <a:prstGeom prst="rect">
+                      <a:avLst/>
+                    </a:prstGeom>
+                  </pic:spPr>
+                </pic:pic>
+              </a:graphicData>
+            </a:graphic>
+          </wp:inline>
+        </w:drawing>
+      </w:r>
+      <w:r>
+        <w:rPr>
+          <w:noProof/>
+        </w:rPr>
+        <w:t xml:space="preserve"> </w:t>
+      </w:r>
+      <w:r>
+        <w:drawing>
+          <wp:inline distT="0" distB="0" distL="0" distR="0" wp14:anchorId="012CCD8B" wp14:editId="4DC00E03">
+            <wp:extent cx="5943600" cy="2262505"/>
+            <wp:effectExtent l="0" t="0" r="0" b="0"/>
+            <wp:docPr id="742648457" name="Picture 1" descr="A screenshot of a computer&#10;&#10;Description automatically generated"/>
+            <wp:cNvGraphicFramePr>
+              <a:graphicFrameLocks xmlns:a="http://schemas.openxmlformats.org/drawingml/2006/main" noChangeAspect="1"/>
+            </wp:cNvGraphicFramePr>
+            <a:graphic xmlns:a="http://schemas.openxmlformats.org/drawingml/2006/main">
+              <a:graphicData uri="http://schemas.openxmlformats.org/drawingml/2006/picture">
+                <pic:pic xmlns:pic="http://schemas.openxmlformats.org/drawingml/2006/picture">
+                  <pic:nvPicPr>
+                    <pic:cNvPr id="742648457" name="Picture 1" descr="A screenshot of a computer&#10;&#10;Description automatically generated"/>
+                    <pic:cNvPicPr/>
+                  </pic:nvPicPr>
+                  <pic:blipFill>
+                    <a:blip r:embed="rId13"/>
+                    <a:stretch>
+                      <a:fillRect/>
+                    </a:stretch>
+                  </pic:blipFill>
+                  <pic:spPr>
+                    <a:xfrm>
+                      <a:off x="0" y="0"/>
+                      <a:ext cx="5943600" cy="2262505"/>
+                    </a:xfrm>
+                    <a:prstGeom prst="rect">
+                      <a:avLst/>
+                    </a:prstGeom>
+                  </pic:spPr>
+                </pic:pic>
+              </a:graphicData>
+            </a:graphic>
+          </wp:inline>
+        </w:drawing>
+      </w:r>
+    </w:p>
+    <w:p>
+      <w:pPr>
+        <w:rPr>
+          <w:noProof/>
+        </w:rPr>
+      </w:pPr>
+    </w:p>
+    <w:p>
+      <w:r>
+        <w:lastRenderedPageBreak/>
+        <w:drawing>
+          <wp:inline distT="0" distB="0" distL="0" distR="0" wp14:anchorId="01389A10" wp14:editId="4F1B3C55">
+            <wp:extent cx="5943600" cy="2899410"/>
+            <wp:effectExtent l="0" t="0" r="0" b="0"/>
+            <wp:docPr id="623038482" name="Picture 1" descr="A screenshot of a computer&#10;&#10;Description automatically generated"/>
+            <wp:cNvGraphicFramePr>
+              <a:graphicFrameLocks xmlns:a="http://schemas.openxmlformats.org/drawingml/2006/main" noChangeAspect="1"/>
+            </wp:cNvGraphicFramePr>
+            <a:graphic xmlns:a="http://schemas.openxmlformats.org/drawingml/2006/main">
+              <a:graphicData uri="http://schemas.openxmlformats.org/drawingml/2006/picture">
+                <pic:pic xmlns:pic="http://schemas.openxmlformats.org/drawingml/2006/picture">
+                  <pic:nvPicPr>
+                    <pic:cNvPr id="623038482" name="Picture 1" descr="A screenshot of a computer&#10;&#10;Description automatically generated"/>
+                    <pic:cNvPicPr/>
+                  </pic:nvPicPr>
+                  <pic:blipFill>
+                    <a:blip r:embed="rId14"/>
+                    <a:stretch>
+                      <a:fillRect/>
+                    </a:stretch>
+                  </pic:blipFill>
+                  <pic:spPr>
+                    <a:xfrm>
+                      <a:off x="0" y="0"/>
+                      <a:ext cx="5943600" cy="2899410"/>
+                    </a:xfrm>
+                    <a:prstGeom prst="rect">
+                      <a:avLst/>
+                    </a:prstGeom>
+                  </pic:spPr>
+                </pic:pic>
+              </a:graphicData>
+            </a:graphic>
+          </wp:inline>
+        </w:drawing>
+      </w:r>
+    </w:p>
+    <w:p/>
+    <w:p>
+      <w:r>
+        <w:drawing>
+          <wp:inline distT="0" distB="0" distL="0" distR="0" wp14:anchorId="7DE1E436" wp14:editId="08415F6D">
+            <wp:extent cx="5943600" cy="1737360"/>
+            <wp:effectExtent l="0" t="0" r="0" b="2540"/>
+            <wp:docPr id="1576885340" name="Picture 1" descr="A screenshot of a computer&#10;&#10;Description automatically generated"/>
+            <wp:cNvGraphicFramePr>
+              <a:graphicFrameLocks xmlns:a="http://schemas.openxmlformats.org/drawingml/2006/main" noChangeAspect="1"/>
+            </wp:cNvGraphicFramePr>
+            <a:graphic xmlns:a="http://schemas.openxmlformats.org/drawingml/2006/main">
+              <a:graphicData uri="http://schemas.openxmlformats.org/drawingml/2006/picture">
+                <pic:pic xmlns:pic="http://schemas.openxmlformats.org/drawingml/2006/picture">
+                  <pic:nvPicPr>
+                    <pic:cNvPr id="1576885340" name="Picture 1" descr="A screenshot of a computer&#10;&#10;Description automatically generated"/>
+                    <pic:cNvPicPr/>
+                  </pic:nvPicPr>
+                  <pic:blipFill>
+                    <a:blip r:embed="rId15"/>
+                    <a:stretch>
+                      <a:fillRect/>
+                    </a:stretch>
+                  </pic:blipFill>
+                  <pic:spPr>
+                    <a:xfrm>
+                      <a:off x="0" y="0"/>
+                      <a:ext cx="5943600" cy="1737360"/>
+                    </a:xfrm>
+                    <a:prstGeom prst="rect">
+                      <a:avLst/>
+                    </a:prstGeom>
+                  </pic:spPr>
+                </pic:pic>
+              </a:graphicData>
+            </a:graphic>
+          </wp:inline>
+        </w:drawing>
+      </w:r>
+    </w:p>
+    <w:p/>
+    <w:p/>
+    <w:p>
+      <w:r>
+        <w:t>On Market intelligence tab you can see there are list of comparable properties as well at the bottom</w:t>
+      </w:r>
+    </w:p>
+    <w:p>
+      <w:r>
+        <w:lastRenderedPageBreak/>
+        <w:drawing>
+          <wp:inline distT="0" distB="0" distL="0" distR="0" wp14:anchorId="77214066" wp14:editId="4B7E0600">
+            <wp:extent cx="5943600" cy="5194300"/>
+            <wp:effectExtent l="0" t="0" r="0" b="0"/>
+            <wp:docPr id="1700270419" name="Picture 1" descr="A screenshot of a market report&#10;&#10;Description automatically generated"/>
+            <wp:cNvGraphicFramePr>
+              <a:graphicFrameLocks xmlns:a="http://schemas.openxmlformats.org/drawingml/2006/main" noChangeAspect="1"/>
+            </wp:cNvGraphicFramePr>
+            <a:graphic xmlns:a="http://schemas.openxmlformats.org/drawingml/2006/main">
+              <a:graphicData uri="http://schemas.openxmlformats.org/drawingml/2006/picture">
+                <pic:pic xmlns:pic="http://schemas.openxmlformats.org/drawingml/2006/picture">
+                  <pic:nvPicPr>
+                    <pic:cNvPr id="1700270419" name="Picture 1" descr="A screenshot of a market report&#10;&#10;Description automatically generated"/>
+                    <pic:cNvPicPr/>
+                  </pic:nvPicPr>
+                  <pic:blipFill>
+                    <a:blip r:embed="rId16"/>
+                    <a:stretch>
+                      <a:fillRect/>
+                    </a:stretch>
+                  </pic:blipFill>
+                  <pic:spPr>
+                    <a:xfrm>
+                      <a:off x="0" y="0"/>
+                      <a:ext cx="5943600" cy="5194300"/>
+                    </a:xfrm>
+                    <a:prstGeom prst="rect">
+                      <a:avLst/>
+                    </a:prstGeom>
+                  </pic:spPr>
+                </pic:pic>
+              </a:graphicData>
+            </a:graphic>
+          </wp:inline>
+        </w:drawing>
+      </w:r>
+    </w:p>
+    <w:p/>
+    <w:p/>
+    <w:p/>
+    <w:p/>
+    <w:p/>
+    <w:p/>
+    <w:p>
+      <w:r>
+        <w:lastRenderedPageBreak/>
+        <w:drawing>
+          <wp:inline distT="0" distB="0" distL="0" distR="0" wp14:anchorId="15CA65DF" wp14:editId="7105F387">
+            <wp:extent cx="5943600" cy="3523615"/>
+            <wp:effectExtent l="0" t="0" r="0" b="0"/>
+            <wp:docPr id="1009212207" name="Picture 1" descr="A screenshot of a computer&#10;&#10;Description automatically generated"/>
+            <wp:cNvGraphicFramePr>
+              <a:graphicFrameLocks xmlns:a="http://schemas.openxmlformats.org/drawingml/2006/main" noChangeAspect="1"/>
+            </wp:cNvGraphicFramePr>
+            <a:graphic xmlns:a="http://schemas.openxmlformats.org/drawingml/2006/main">
+              <a:graphicData uri="http://schemas.openxmlformats.org/drawingml/2006/picture">
+                <pic:pic xmlns:pic="http://schemas.openxmlformats.org/drawingml/2006/picture">
+                  <pic:nvPicPr>
+                    <pic:cNvPr id="1009212207" name="Picture 1" descr="A screenshot of a computer&#10;&#10;Description automatically generated"/>
+                    <pic:cNvPicPr/>
+                  </pic:nvPicPr>
+                  <pic:blipFill>
+                    <a:blip r:embed="rId17"/>
+                    <a:stretch>
+                      <a:fillRect/>
+                    </a:stretch>
+                  </pic:blipFill>
+                  <pic:spPr>
+                    <a:xfrm>
+                      <a:off x="0" y="0"/>
+                      <a:ext cx="5943600" cy="3523615"/>
+                    </a:xfrm>
+                    <a:prstGeom prst="rect">
+                      <a:avLst/>
+                    </a:prstGeom>
+                  </pic:spPr>
+                </pic:pic>
+              </a:graphicData>
+            </a:graphic>
+          </wp:inline>
+        </w:drawing>
+      </w:r>
+    </w:p>
+    <w:p/>
+    <w:p>
+      <w:r>
+        <w:drawing>
+          <wp:inline distT="0" distB="0" distL="0" distR="0" wp14:anchorId="246D4261" wp14:editId="6143E67B">
+            <wp:extent cx="5943600" cy="1927860"/>
+            <wp:effectExtent l="0" t="0" r="0" b="2540"/>
+            <wp:docPr id="1533328818" name="Picture 1"/>
+            <wp:cNvGraphicFramePr>
+              <a:graphicFrameLocks xmlns:a="http://schemas.openxmlformats.org/drawingml/2006/main" noChangeAspect="1"/>
+            </wp:cNvGraphicFramePr>
+            <a:graphic xmlns:a="http://schemas.openxmlformats.org/drawingml/2006/main">
+              <a:graphicData uri="http://schemas.openxmlformats.org/drawingml/2006/picture">
+                <pic:pic xmlns:pic="http://schemas.openxmlformats.org/drawingml/2006/picture">
+                  <pic:nvPicPr>
+                    <pic:cNvPr id="1533328818" name=""/>
+                    <pic:cNvPicPr/>
+                  </pic:nvPicPr>
+                  <pic:blipFill>
+                    <a:blip r:embed="rId18"/>
+                    <a:stretch>
+                      <a:fillRect/>
+                    </a:stretch>
+                  </pic:blipFill>
+                  <pic:spPr>
+                    <a:xfrm>
+                      <a:off x="0" y="0"/>
+                      <a:ext cx="5943600" cy="1927860"/>
                     </a:xfrm>
                     <a:prstGeom prst="rect">
                       <a:avLst/>

</xml_diff>